<commit_message>
test(contracts): numbered section headings in M5 fixtures for reference resolution
</commit_message>
<xml_diff>
--- a/backend/src/test/resources/fixtures/m5-dual-concept.docx
+++ b/backend/src/test/resources/fixtures/m5-dual-concept.docx
@@ -23,7 +23,7 @@
         <w:pStyle w:val="Heading1"/>
       </w:pPr>
       <w:r>
-        <w:t xml:space="preserve">Limitation of Liability</w:t>
+        <w:t xml:space="preserve">6. Limitation of Liability</w:t>
       </w:r>
     </w:p>
     <w:p>
@@ -39,7 +39,7 @@
         <w:pStyle w:val="Heading1"/>
       </w:pPr>
       <w:r>
-        <w:t xml:space="preserve">Data Protection</w:t>
+        <w:t xml:space="preserve">2. Data Protection</w:t>
       </w:r>
     </w:p>
     <w:p>

</xml_diff>